<commit_message>
the EGZ_Facilitie's primary Hospital Data final version
</commit_message>
<xml_diff>
--- a/Desktop/CS data/Facility_Form15/Blood_Bank.docx
+++ b/Desktop/CS data/Facility_Form15/Blood_Bank.docx
@@ -466,14 +466,8 @@
                 <w:szCs w:val="24"/>
               </w:rPr>
             </w:pPr>
-            <w:r>
-              <w:rPr>
-                <w:rFonts w:ascii="Power Geez Unicode1" w:hAnsi="Power Geez Unicode1"/>
-                <w:sz w:val="24"/>
-                <w:szCs w:val="24"/>
-              </w:rPr>
-              <w:t>XV</w:t>
-            </w:r>
+            <w:bookmarkStart w:id="0" w:name="_GoBack"/>
+            <w:bookmarkEnd w:id="0"/>
           </w:p>
         </w:tc>
         <w:tc>
@@ -650,14 +644,6 @@
                 <w:szCs w:val="24"/>
               </w:rPr>
             </w:pPr>
-            <w:r>
-              <w:rPr>
-                <w:rFonts w:ascii="Power Geez Unicode1" w:hAnsi="Power Geez Unicode1"/>
-                <w:sz w:val="24"/>
-                <w:szCs w:val="24"/>
-              </w:rPr>
-              <w:t>XV</w:t>
-            </w:r>
           </w:p>
         </w:tc>
         <w:tc>
@@ -835,14 +821,6 @@
                 <w:szCs w:val="24"/>
               </w:rPr>
             </w:pPr>
-            <w:r>
-              <w:rPr>
-                <w:rFonts w:ascii="Power Geez Unicode1" w:hAnsi="Power Geez Unicode1"/>
-                <w:sz w:val="24"/>
-                <w:szCs w:val="24"/>
-              </w:rPr>
-              <w:t>Xll</w:t>
-            </w:r>
           </w:p>
         </w:tc>
         <w:tc>
@@ -1020,14 +998,6 @@
                 <w:szCs w:val="24"/>
               </w:rPr>
             </w:pPr>
-            <w:r>
-              <w:rPr>
-                <w:rFonts w:ascii="Power Geez Unicode1" w:hAnsi="Power Geez Unicode1"/>
-                <w:sz w:val="24"/>
-                <w:szCs w:val="24"/>
-              </w:rPr>
-              <w:t>Xl</w:t>
-            </w:r>
           </w:p>
         </w:tc>
         <w:tc>
@@ -1205,14 +1175,6 @@
                 <w:szCs w:val="24"/>
               </w:rPr>
             </w:pPr>
-            <w:r>
-              <w:rPr>
-                <w:rFonts w:ascii="Power Geez Unicode1" w:hAnsi="Power Geez Unicode1"/>
-                <w:sz w:val="24"/>
-                <w:szCs w:val="24"/>
-              </w:rPr>
-              <w:t>X</w:t>
-            </w:r>
           </w:p>
         </w:tc>
         <w:tc>
@@ -1249,8 +1211,6 @@
           <w:szCs w:val="24"/>
         </w:rPr>
       </w:pPr>
-      <w:bookmarkStart w:id="0" w:name="_GoBack"/>
-      <w:bookmarkEnd w:id="0"/>
     </w:p>
     <w:sectPr>
       <w:headerReference w:type="default" r:id="rId7"/>
@@ -3533,7 +3493,7 @@
   <a:extraClrSchemeLst/>
   <a:extLst>
     <a:ext uri="{05A4C25C-085E-4340-85A3-A5531E510DB2}">
-      <thm15:themeFamily xmlns="" xmlns:thm15="http://schemas.microsoft.com/office/thememl/2012/main" name="Office Theme" id="{62F939B6-93AF-4DB8-9C6B-D6C7DFDC589F}" vid="{4A3C46E8-61CC-4603-A589-7422A47A8E4A}"/>
+      <thm15:themeFamily xmlns:thm15="http://schemas.microsoft.com/office/thememl/2012/main" xmlns="" name="Office Theme" id="{62F939B6-93AF-4DB8-9C6B-D6C7DFDC589F}" vid="{4A3C46E8-61CC-4603-A589-7422A47A8E4A}"/>
     </a:ext>
   </a:extLst>
 </a:theme>

</xml_diff>